<commit_message>
feat: dynamic per-equipment advantages in equipment offer template
Wrap each advantages section in a docxtpl {%p if %} conditional so an offer
shows only the relevant copy: show_burner_adv / show_blower_adv /
show_pumping_adv. Blower->Blower, Burner->Film Burner, HPU+PU->Heating &
Pumping Units; combined-equipment shows each present type. Sample refreshed
(blower+pumping case).

Co-Authored-By: Claude Opus 4.8 <noreply@anthropic.com>
</commit_message>
<xml_diff>
--- a/Equipment_Offer_Template.docx
+++ b/Equipment_Offer_Template.docx
@@ -6803,6 +6803,15 @@
       </w:pPr>
     </w:p>
     <w:p>
+      <w:r>
+        <w:rPr>
+          <w:rFonts w:ascii="Calibri" w:hAnsi="Calibri" w:cs="Calibri"/>
+          <w:color w:val="1F2937"/>
+        </w:rPr>
+        <w:t>{%p if show_burner_adv %}</w:t>
+      </w:r>
+    </w:p>
+    <w:p>
       <w:pPr>
         <w:autoSpaceDE w:val="0"/>
         <w:autoSpaceDN w:val="0"/>
@@ -7291,6 +7300,24 @@
       </w:pPr>
     </w:p>
     <w:p>
+      <w:r>
+        <w:rPr>
+          <w:rFonts w:ascii="Calibri" w:hAnsi="Calibri" w:cs="Calibri"/>
+          <w:color w:val="1F2937"/>
+        </w:rPr>
+        <w:t>{%p endif %}</w:t>
+      </w:r>
+    </w:p>
+    <w:p>
+      <w:r>
+        <w:rPr>
+          <w:rFonts w:ascii="Calibri" w:hAnsi="Calibri" w:cs="Calibri"/>
+          <w:color w:val="1F2937"/>
+        </w:rPr>
+        <w:t>{%p if show_blower_adv %}</w:t>
+      </w:r>
+    </w:p>
+    <w:p>
       <w:pPr>
         <w:autoSpaceDE w:val="0"/>
         <w:autoSpaceDN w:val="0"/>
@@ -7586,6 +7613,24 @@
           <w:szCs w:val="28"/>
         </w:rPr>
       </w:pPr>
+    </w:p>
+    <w:p>
+      <w:r>
+        <w:rPr>
+          <w:rFonts w:ascii="Calibri" w:hAnsi="Calibri" w:cs="Calibri"/>
+          <w:color w:val="1F2937"/>
+        </w:rPr>
+        <w:t>{%p endif %}</w:t>
+      </w:r>
+    </w:p>
+    <w:p>
+      <w:r>
+        <w:rPr>
+          <w:rFonts w:ascii="Calibri" w:hAnsi="Calibri" w:cs="Calibri"/>
+          <w:color w:val="1F2937"/>
+        </w:rPr>
+        <w:t>{%p if show_pumping_adv %}</w:t>
+      </w:r>
     </w:p>
     <w:p>
       <w:pPr>
@@ -7881,6 +7926,15 @@
           <w:szCs w:val="22"/>
         </w:rPr>
       </w:pPr>
+    </w:p>
+    <w:p>
+      <w:r>
+        <w:rPr>
+          <w:rFonts w:ascii="Calibri" w:hAnsi="Calibri" w:cs="Calibri"/>
+          <w:color w:val="1F2937"/>
+        </w:rPr>
+        <w:t>{%p endif %}</w:t>
+      </w:r>
     </w:p>
     <w:p>
       <w:pPr>

</xml_diff>